<commit_message>
Add actuarial data extract & DOCX generators
Introduce a set of actuarial tooling and generated artifacts: new extraction scripts (extract-csv-demographics.mjs, extract-group-demographics.mjs) and DOCX builders (generate-deident-report.mjs, generate-docx-v3.mjs, generate-part6-worksheet.mjs) under docs/actuarial. These scripts parse Zoho CSVs, produce grouped demographics CSVs, and generate de-identified and submission Word reports. Add generated outputs (PIF_Actuarial_Data_CSVs.zip, PIF_DeIdentification_Report.docx, PIF_Part6_Program_Structure_Worksheet.docx) and update the submission package docx; remove the old cover email docx. Also update small supabase temp files (.temp/pooler-url, .temp/storage-migration).
</commit_message>
<xml_diff>
--- a/docs/actuarial/output/PIF_Actuarial_Submission_Package_v3.docx
+++ b/docs/actuarial/output/PIF_Actuarial_Submission_Package_v3.docx
@@ -23,7 +23,7 @@
           <w:sz w:val="48"/>
           <w:szCs w:val="48"/>
         </w:rPr>
-        <w:t xml:space="preserve">Pay It Forward HealthShare</w:t>
+        <w:t xml:space="preserve">Pay It Forward Health</w:t>
       </w:r>
     </w:p>
     <w:p>
@@ -85,7 +85,7 @@
           <w:sz w:val="24"/>
           <w:szCs w:val="24"/>
         </w:rPr>
-        <w:t xml:space="preserve">Organization: Pay It Forward HealthShare</w:t>
+        <w:t xml:space="preserve">Organization: Pay It Forward Health</w:t>
       </w:r>
     </w:p>
     <w:p>
@@ -2234,7 +2234,7 @@
                 <w:sz w:val="18"/>
                 <w:szCs w:val="18"/>
               </w:rPr>
-              <w:t xml:space="preserve">Total IUA applied (deductible equivalent)</w:t>
+              <w:t xml:space="preserve">Total Initial Unshareable Amount applied (deductible equivalent)</w:t>
             </w:r>
           </w:p>
         </w:tc>
@@ -2547,7 +2547,7 @@
                 <w:sz w:val="18"/>
                 <w:szCs w:val="18"/>
               </w:rPr>
-              <w:t xml:space="preserve">Category (e.g., ER, preventive, surgical, etc.)</w:t>
+              <w:t xml:space="preserve">Category (e.g., ER, preventive, surgical, diagnostic, prescription, etc.)</w:t>
             </w:r>
           </w:p>
         </w:tc>
@@ -3454,7 +3454,7 @@
                 <w:sz w:val="18"/>
                 <w:szCs w:val="18"/>
               </w:rPr>
-              <w:t xml:space="preserve">Sum of all active schedule amounts</w:t>
+              <w:t xml:space="preserve">Sum of all active schedule amounts (expected revenue)</w:t>
             </w:r>
           </w:p>
         </w:tc>
@@ -4095,7 +4095,7 @@
                 <w:sz w:val="18"/>
                 <w:szCs w:val="18"/>
               </w:rPr>
-              <w:t xml:space="preserve">Bucketed range (0-17, 18-25, 26-35, etc.)</w:t>
+              <w:t xml:space="preserve">Bucketed range (0-17, 18-25, 26-35, 36-45, 46-55, 56-64, 65+)</w:t>
             </w:r>
           </w:p>
         </w:tc>
@@ -4860,7 +4860,7 @@
                 <w:sz w:val="18"/>
                 <w:szCs w:val="18"/>
               </w:rPr>
-              <w:t xml:space="preserve">Month of underlying medical service (incident date cohort)</w:t>
+              <w:t xml:space="preserve">Month in which the underlying medical service occurred (incident date cohort). Used by actuaries to build completion triangles and analyze claims by date of service rather than date of payment.</w:t>
             </w:r>
           </w:p>
         </w:tc>
@@ -4931,7 +4931,7 @@
                 <w:sz w:val="18"/>
                 <w:szCs w:val="18"/>
               </w:rPr>
-              <w:t xml:space="preserve">Daily exposure: eligible members per day, summed / days in month</w:t>
+              <w:t xml:space="preserve">Total exposure units for the month. Calculated as the count of members eligible for sharing on each day of the month, summed and divided by the number of days in the month.</w:t>
             </w:r>
           </w:p>
         </w:tc>
@@ -5259,7 +5259,7 @@
                 <w:sz w:val="18"/>
                 <w:szCs w:val="18"/>
               </w:rPr>
-              <w:t xml:space="preserve">Approved amounts attributed to service date (not submission)</w:t>
+              <w:t xml:space="preserve">Approved sharing amounts attributed to the date of service (incident date), not the date of submission or approval. This represents incurred claims for actuarial loss development analysis.</w:t>
             </w:r>
           </w:p>
         </w:tc>
@@ -5392,7 +5392,7 @@
                 <w:sz w:val="18"/>
                 <w:szCs w:val="18"/>
               </w:rPr>
-              <w:t xml:space="preserve">Approved but unpaid (open liabilities / IBNR proxy)</w:t>
+              <w:t xml:space="preserve">Approved but unpaid needs (open liabilities / IBNR proxy)</w:t>
             </w:r>
           </w:p>
         </w:tc>
@@ -5463,7 +5463,7 @@
                 <w:sz w:val="18"/>
                 <w:szCs w:val="18"/>
               </w:rPr>
-              <w:t xml:space="preserve">Per Member Per Month cost (incurred / member-months)</w:t>
+              <w:t xml:space="preserve">Per Member Per Month cost (incurred amount / member-months)</w:t>
             </w:r>
           </w:p>
         </w:tc>
@@ -5525,7 +5525,7 @@
                 <w:sz w:val="18"/>
                 <w:szCs w:val="18"/>
               </w:rPr>
-              <w:t xml:space="preserve">Avg days from service date to submission</w:t>
+              <w:t xml:space="preserve">Average days from incident/service date to need submission</w:t>
             </w:r>
           </w:p>
         </w:tc>
@@ -5596,7 +5596,7 @@
                 <w:sz w:val="18"/>
                 <w:szCs w:val="18"/>
               </w:rPr>
-              <w:t xml:space="preserve">Avg days from submission to reimbursement</w:t>
+              <w:t xml:space="preserve">Average days from submission to reimbursement</w:t>
             </w:r>
           </w:p>
         </w:tc>
@@ -5617,7 +5617,7 @@
           <w:sz w:val="20"/>
           <w:szCs w:val="20"/>
         </w:rPr>
-        <w:t xml:space="preserve">Actuarial Use: PMPM cost calculation, IBNR reserve development, claim completion factor triangles, solvency and reserve adequacy analysis.</w:t>
+        <w:t xml:space="preserve">Actuarial Use: PMPM cost calculation, incurred-but-not-reported (IBNR) reserve development, claim completion factor triangles, solvency and reserve adequacy analysis.</w:t>
       </w:r>
     </w:p>
     <w:p>
@@ -6586,7 +6586,7 @@
                 <w:sz w:val="18"/>
                 <w:szCs w:val="18"/>
               </w:rPr>
-              <w:t xml:space="preserve">Dataset 5: pending amount + report/payment lag for completion triangles</w:t>
+              <w:t xml:space="preserve">Dataset 5: pending amount + report/payment lag for completion factor triangles by service month cohort</w:t>
             </w:r>
           </w:p>
         </w:tc>
@@ -6904,7 +6904,7 @@
                 <w:sz w:val="18"/>
                 <w:szCs w:val="18"/>
               </w:rPr>
-              <w:t xml:space="preserve">Dataset 5: service month cohort + lag data for completion triangles</w:t>
+              <w:t xml:space="preserve">Dataset 5: service month cohort + report lag + payment lag enable completion factor triangles</w:t>
             </w:r>
           </w:p>
         </w:tc>
@@ -7639,7 +7639,7 @@
           <w:sz w:val="22"/>
           <w:szCs w:val="22"/>
         </w:rPr>
-        <w:t xml:space="preserve">The items highlighted in red above must be completed with your specific program rules before submission to the actuary. The actuary requires this information because utilization behavior is directly influenced by benefit design — they price the behavior a plan encourages.</w:t>
+        <w:t xml:space="preserve">The bracketed items above must be completed with your specific program rules before submission to the actuary. The actuary requires this information because utilization behavior is directly influenced by benefit design — they price the behavior a plan encourages.</w:t>
       </w:r>
     </w:p>
     <w:p>
@@ -8165,7 +8165,7 @@
         <w:sz w:val="16"/>
         <w:szCs w:val="16"/>
       </w:rPr>
-      <w:t xml:space="preserve">Pay It Forward HealthShare</w:t>
+      <w:t xml:space="preserve">Pay It Forward Health</w:t>
     </w:r>
     <w:r>
       <w:rPr>

</xml_diff>